<commit_message>
Cite the Zenodo record in the manuscript
Replaces the "[DOI to be inserted before submission]" placeholder in Data
availability, and adds the same DOI where Methods describes the Zenodo
record: 10.5281/zenodo.22053001 (concept DOI, resolves to the latest
version). Tracked changes under "Claude".

Co-Authored-By: Claude Opus 5.5 <noreply@anthropic.com>
Claude-Session: https://claude.ai/code/session_019RLzpN86LcpmmoedCke7VX
</commit_message>
<xml_diff>
--- a/site/index_nature_submission_updated.docx
+++ b/site/index_nature_submission_updated.docx
@@ -5345,7 +5345,20 @@
         </w:r>
       </w:hyperlink>
       <w:r>
-        <w:t xml:space="preserve"> under the MIT License. The harmonized ZCTA analysis file is deposited as a separate Zenodo record under CC-BY-4.0.</w:t>
+        <w:t xml:space="preserve"> under the MIT License. The harmonized ZCTA analysis file is </w:t>
+      </w:r>
+      <w:del w:id="30002" w:author="Claude" w:date="2026-10-26T00:00:00Z">
+        <w:r>
+          <w:delText xml:space="preserve">deposited as a separate Zenodo record under CC-BY-4.0</w:delText>
+        </w:r>
+      </w:del>
+      <w:ins w:id="30003" w:author="Claude" w:date="2026-10-26T00:00:00Z">
+        <w:r>
+          <w:t xml:space="preserve">deposited as a separate Zenodo record under CC-BY-4.0 (https://doi.org/10.5281/zenodo.22053001)</w:t>
+        </w:r>
+      </w:ins>
+      <w:r>
+        <w:t xml:space="preserve">.</w:t>
       </w:r>
     </w:p>
     <w:p>
@@ -6326,7 +6339,20 @@
     </w:p>
     <w:p>
       <w:r>
-        <w:t>The harmonized ZCTA analysis dataset is deposited at Zenodo under CC-BY-4.0 [DOI to be inserted before submission]. All underlying sources are public and are listed in the Supplementary Information.</w:t>
+        <w:t xml:space="preserve">The harmonized ZCTA analysis dataset is deposited at Zenodo under CC-BY-4.0 </w:t>
+      </w:r>
+      <w:del w:id="30000" w:author="Claude" w:date="2026-10-26T00:00:00Z">
+        <w:r>
+          <w:delText xml:space="preserve">[DOI to be inserted before submission]</w:delText>
+        </w:r>
+      </w:del>
+      <w:ins w:id="30001" w:author="Claude" w:date="2026-10-26T00:00:00Z">
+        <w:r>
+          <w:t xml:space="preserve">(https://doi.org/10.5281/zenodo.22053001)</w:t>
+        </w:r>
+      </w:ins>
+      <w:r>
+        <w:t xml:space="preserve">. All underlying sources are public and are listed in the Supplementary Information.</w:t>
       </w:r>
     </w:p>
     <w:p>

</xml_diff>